<commit_message>
Replace project overview document
</commit_message>
<xml_diff>
--- a/CoreTech_Labs_Project_Overview.docx
+++ b/CoreTech_Labs_Project_Overview.docx
@@ -1153,7 +1153,7 @@
           <w:sz w:val="22"/>
           <w:szCs w:val="22"/>
         </w:rPr>
-        <w:t>README.md</w:t>
+        <w:t>CoreTech_Labs_Excel_Workbook.xlsx</w:t>
       </w:r>
     </w:p>
     <w:p>
@@ -1174,7 +1174,7 @@
           <w:sz w:val="22"/>
           <w:szCs w:val="22"/>
         </w:rPr>
-        <w:t>CoreTech_Labs_Excel_Workbook.xlsx</w:t>
+        <w:t>dashboard-preview.jpg</w:t>
       </w:r>
     </w:p>
     <w:p>
@@ -1195,28 +1195,39 @@
           <w:sz w:val="22"/>
           <w:szCs w:val="22"/>
         </w:rPr>
-        <w:t>dashboard-preview.jpg</w:t>
-      </w:r>
-    </w:p>
-    <w:p>
-      <w:pPr>
-        <w:numPr>
-          <w:ilvl w:val="0"/>
-          <w:numId w:val="20"/>
-        </w:numPr>
-        <w:rPr>
-          <w:rFonts w:ascii="Calibri" w:hAnsi="Calibri" w:cs="Calibri"/>
-          <w:sz w:val="22"/>
-          <w:szCs w:val="22"/>
-        </w:rPr>
-      </w:pPr>
-      <w:r>
-        <w:rPr>
-          <w:rFonts w:ascii="Calibri" w:hAnsi="Calibri" w:cs="Calibri"/>
-          <w:sz w:val="22"/>
-          <w:szCs w:val="22"/>
-        </w:rPr>
-        <w:t>CoreTech_Labs_Presentation_Slides.pptx</w:t>
+        <w:t>CoreTech_Labs_</w:t>
+      </w:r>
+      <w:r>
+        <w:rPr>
+          <w:rFonts w:ascii="Calibri" w:hAnsi="Calibri" w:cs="Calibri"/>
+          <w:sz w:val="22"/>
+          <w:szCs w:val="22"/>
+        </w:rPr>
+        <w:t>Project</w:t>
+      </w:r>
+      <w:r>
+        <w:rPr>
+          <w:rFonts w:ascii="Calibri" w:hAnsi="Calibri" w:cs="Calibri"/>
+          <w:sz w:val="22"/>
+          <w:szCs w:val="22"/>
+        </w:rPr>
+        <w:t>_</w:t>
+      </w:r>
+      <w:r>
+        <w:rPr>
+          <w:rFonts w:ascii="Calibri" w:hAnsi="Calibri" w:cs="Calibri"/>
+          <w:sz w:val="22"/>
+          <w:szCs w:val="22"/>
+        </w:rPr>
+        <w:t>Overview</w:t>
+      </w:r>
+      <w:r>
+        <w:rPr>
+          <w:rFonts w:ascii="Calibri" w:hAnsi="Calibri" w:cs="Calibri"/>
+          <w:sz w:val="22"/>
+          <w:szCs w:val="22"/>
+        </w:rPr>
+        <w:t>.pptx</w:t>
       </w:r>
     </w:p>
     <w:p>

</xml_diff>